<commit_message>
Lock the tables down for the hosted data API (row level security)
Supabase serves the public schema through its Data API to the anon and
authenticated roles. Every table had RLS off and those roles had SELECT
on 75 of 76 tables (Supabase security advisor: ERROR), so anyone with the
project URL and its public key could read the data around the app's
permission checks.

- Enable row level security on every table, with no policies.
- Revoke anon/authenticated privileges on tables and sequences, also by
  default for tables created later (skipped where those roles don't
  exist: local, CI, Docker).
- Pin search_path on our trigger functions (advisor 0011).
- The app connects as the table owner (BYPASSRLS on Supabase) and is not
  affected. An integration test now fails when a table without RLS
  appears.

Co-Authored-By: Claude Opus 5.5 <noreply@anthropic.com>
Claude-Session: https://claude.ai/code/session_01SUUhZJv1BWiVGjCMV3XTxQ
</commit_message>
<xml_diff>
--- a/docs/woli-Co-so-du-lieu.docx
+++ b/docs/woli-Co-so-du-lieu.docx
@@ -161,7 +161,7 @@
           <w:sz w:val="22"/>
           <w:szCs w:val="22"/>
         </w:rPr>
-        <w:t>1.0</w:t>
+        <w:t>1.1</w:t>
       </w:r>
     </w:p>
     <w:p>
@@ -275,7 +275,7 @@
             </w:rPr>
             <w:fldChar w:fldCharType="separate"/>
           </w:r>
-          <w:hyperlink w:anchor="__RefHeading___Toc2456_496122586">
+          <w:hyperlink w:anchor="__RefHeading___Toc2464_231373292">
             <w:r>
               <w:rPr>
                 <w:rStyle w:val="IndexLink"/>
@@ -295,7 +295,7 @@
             </w:tabs>
             <w:rPr/>
           </w:pPr>
-          <w:hyperlink w:anchor="__RefHeading___Toc2458_496122586">
+          <w:hyperlink w:anchor="__RefHeading___Toc2466_231373292">
             <w:r>
               <w:rPr>
                 <w:rStyle w:val="IndexLink"/>
@@ -315,7 +315,7 @@
             </w:tabs>
             <w:rPr/>
           </w:pPr>
-          <w:hyperlink w:anchor="__RefHeading___Toc2460_496122586">
+          <w:hyperlink w:anchor="__RefHeading___Toc2468_231373292">
             <w:r>
               <w:rPr>
                 <w:rStyle w:val="IndexLink"/>
@@ -335,7 +335,7 @@
             </w:tabs>
             <w:rPr/>
           </w:pPr>
-          <w:hyperlink w:anchor="__RefHeading___Toc2462_496122586">
+          <w:hyperlink w:anchor="__RefHeading___Toc2470_231373292">
             <w:r>
               <w:rPr>
                 <w:rStyle w:val="IndexLink"/>
@@ -355,7 +355,7 @@
             </w:tabs>
             <w:rPr/>
           </w:pPr>
-          <w:hyperlink w:anchor="__RefHeading___Toc2464_496122586">
+          <w:hyperlink w:anchor="__RefHeading___Toc2472_231373292">
             <w:r>
               <w:rPr>
                 <w:rStyle w:val="IndexLink"/>
@@ -375,7 +375,7 @@
             </w:tabs>
             <w:rPr/>
           </w:pPr>
-          <w:hyperlink w:anchor="__RefHeading___Toc2466_496122586">
+          <w:hyperlink w:anchor="__RefHeading___Toc2474_231373292">
             <w:r>
               <w:rPr>
                 <w:rStyle w:val="IndexLink"/>
@@ -395,7 +395,7 @@
             </w:tabs>
             <w:rPr/>
           </w:pPr>
-          <w:hyperlink w:anchor="__RefHeading___Toc2468_496122586">
+          <w:hyperlink w:anchor="__RefHeading___Toc2476_231373292">
             <w:r>
               <w:rPr>
                 <w:rStyle w:val="IndexLink"/>
@@ -415,7 +415,7 @@
             </w:tabs>
             <w:rPr/>
           </w:pPr>
-          <w:hyperlink w:anchor="__RefHeading___Toc2470_496122586">
+          <w:hyperlink w:anchor="__RefHeading___Toc2478_231373292">
             <w:r>
               <w:rPr>
                 <w:rStyle w:val="IndexLink"/>
@@ -435,7 +435,7 @@
             </w:tabs>
             <w:rPr/>
           </w:pPr>
-          <w:hyperlink w:anchor="__RefHeading___Toc2472_496122586">
+          <w:hyperlink w:anchor="__RefHeading___Toc2480_231373292">
             <w:r>
               <w:rPr>
                 <w:rStyle w:val="IndexLink"/>
@@ -455,7 +455,7 @@
             </w:tabs>
             <w:rPr/>
           </w:pPr>
-          <w:hyperlink w:anchor="__RefHeading___Toc2474_496122586">
+          <w:hyperlink w:anchor="__RefHeading___Toc2482_231373292">
             <w:r>
               <w:rPr>
                 <w:rStyle w:val="IndexLink"/>
@@ -475,7 +475,7 @@
             </w:tabs>
             <w:rPr/>
           </w:pPr>
-          <w:hyperlink w:anchor="__RefHeading___Toc2476_496122586">
+          <w:hyperlink w:anchor="__RefHeading___Toc2484_231373292">
             <w:r>
               <w:rPr>
                 <w:rStyle w:val="IndexLink"/>
@@ -495,7 +495,7 @@
             </w:tabs>
             <w:rPr/>
           </w:pPr>
-          <w:hyperlink w:anchor="__RefHeading___Toc2478_496122586">
+          <w:hyperlink w:anchor="__RefHeading___Toc2486_231373292">
             <w:r>
               <w:rPr>
                 <w:rStyle w:val="IndexLink"/>
@@ -515,7 +515,7 @@
             </w:tabs>
             <w:rPr/>
           </w:pPr>
-          <w:hyperlink w:anchor="__RefHeading___Toc2480_496122586">
+          <w:hyperlink w:anchor="__RefHeading___Toc2488_231373292">
             <w:r>
               <w:rPr>
                 <w:rStyle w:val="IndexLink"/>
@@ -535,7 +535,7 @@
             </w:tabs>
             <w:rPr/>
           </w:pPr>
-          <w:hyperlink w:anchor="__RefHeading___Toc2482_496122586">
+          <w:hyperlink w:anchor="__RefHeading___Toc2490_231373292">
             <w:r>
               <w:rPr>
                 <w:rStyle w:val="IndexLink"/>
@@ -555,7 +555,7 @@
             </w:tabs>
             <w:rPr/>
           </w:pPr>
-          <w:hyperlink w:anchor="__RefHeading___Toc2484_496122586">
+          <w:hyperlink w:anchor="__RefHeading___Toc2492_231373292">
             <w:r>
               <w:rPr>
                 <w:rStyle w:val="IndexLink"/>
@@ -575,7 +575,7 @@
             </w:tabs>
             <w:rPr/>
           </w:pPr>
-          <w:hyperlink w:anchor="__RefHeading___Toc2486_496122586">
+          <w:hyperlink w:anchor="__RefHeading___Toc2494_231373292">
             <w:r>
               <w:rPr>
                 <w:rStyle w:val="IndexLink"/>
@@ -595,7 +595,7 @@
             </w:tabs>
             <w:rPr/>
           </w:pPr>
-          <w:hyperlink w:anchor="__RefHeading___Toc2488_496122586">
+          <w:hyperlink w:anchor="__RefHeading___Toc2496_231373292">
             <w:r>
               <w:rPr>
                 <w:rStyle w:val="IndexLink"/>
@@ -615,7 +615,7 @@
             </w:tabs>
             <w:rPr/>
           </w:pPr>
-          <w:hyperlink w:anchor="__RefHeading___Toc2490_496122586">
+          <w:hyperlink w:anchor="__RefHeading___Toc2498_231373292">
             <w:r>
               <w:rPr>
                 <w:rStyle w:val="IndexLink"/>
@@ -635,7 +635,7 @@
             </w:tabs>
             <w:rPr/>
           </w:pPr>
-          <w:hyperlink w:anchor="__RefHeading___Toc2492_496122586">
+          <w:hyperlink w:anchor="__RefHeading___Toc2500_231373292">
             <w:r>
               <w:rPr>
                 <w:rStyle w:val="IndexLink"/>
@@ -655,7 +655,7 @@
             </w:tabs>
             <w:rPr/>
           </w:pPr>
-          <w:hyperlink w:anchor="__RefHeading___Toc2494_496122586">
+          <w:hyperlink w:anchor="__RefHeading___Toc2502_231373292">
             <w:r>
               <w:rPr>
                 <w:rStyle w:val="IndexLink"/>
@@ -675,7 +675,7 @@
             </w:tabs>
             <w:rPr/>
           </w:pPr>
-          <w:hyperlink w:anchor="__RefHeading___Toc2496_496122586">
+          <w:hyperlink w:anchor="__RefHeading___Toc2504_231373292">
             <w:r>
               <w:rPr>
                 <w:rStyle w:val="IndexLink"/>
@@ -695,7 +695,7 @@
             </w:tabs>
             <w:rPr/>
           </w:pPr>
-          <w:hyperlink w:anchor="__RefHeading___Toc2498_496122586">
+          <w:hyperlink w:anchor="__RefHeading___Toc2506_231373292">
             <w:r>
               <w:rPr>
                 <w:rStyle w:val="IndexLink"/>
@@ -715,7 +715,7 @@
             </w:tabs>
             <w:rPr/>
           </w:pPr>
-          <w:hyperlink w:anchor="__RefHeading___Toc2500_496122586">
+          <w:hyperlink w:anchor="__RefHeading___Toc2508_231373292">
             <w:r>
               <w:rPr>
                 <w:rStyle w:val="IndexLink"/>
@@ -735,7 +735,7 @@
             </w:tabs>
             <w:rPr/>
           </w:pPr>
-          <w:hyperlink w:anchor="__RefHeading___Toc2502_496122586">
+          <w:hyperlink w:anchor="__RefHeading___Toc2510_231373292">
             <w:r>
               <w:rPr>
                 <w:rStyle w:val="IndexLink"/>
@@ -755,7 +755,7 @@
             </w:tabs>
             <w:rPr/>
           </w:pPr>
-          <w:hyperlink w:anchor="__RefHeading___Toc2504_496122586">
+          <w:hyperlink w:anchor="__RefHeading___Toc2512_231373292">
             <w:r>
               <w:rPr>
                 <w:rStyle w:val="IndexLink"/>
@@ -775,7 +775,7 @@
             </w:tabs>
             <w:rPr/>
           </w:pPr>
-          <w:hyperlink w:anchor="__RefHeading___Toc2506_496122586">
+          <w:hyperlink w:anchor="__RefHeading___Toc2514_231373292">
             <w:r>
               <w:rPr>
                 <w:rStyle w:val="IndexLink"/>
@@ -795,7 +795,7 @@
             </w:tabs>
             <w:rPr/>
           </w:pPr>
-          <w:hyperlink w:anchor="__RefHeading___Toc2508_496122586">
+          <w:hyperlink w:anchor="__RefHeading___Toc2516_231373292">
             <w:r>
               <w:rPr>
                 <w:rStyle w:val="IndexLink"/>
@@ -815,7 +815,7 @@
             </w:tabs>
             <w:rPr/>
           </w:pPr>
-          <w:hyperlink w:anchor="__RefHeading___Toc2510_496122586">
+          <w:hyperlink w:anchor="__RefHeading___Toc2518_231373292">
             <w:r>
               <w:rPr>
                 <w:rStyle w:val="IndexLink"/>
@@ -835,7 +835,7 @@
             </w:tabs>
             <w:rPr/>
           </w:pPr>
-          <w:hyperlink w:anchor="__RefHeading___Toc2512_496122586">
+          <w:hyperlink w:anchor="__RefHeading___Toc2520_231373292">
             <w:r>
               <w:rPr>
                 <w:rStyle w:val="IndexLink"/>
@@ -855,7 +855,7 @@
             </w:tabs>
             <w:rPr/>
           </w:pPr>
-          <w:hyperlink w:anchor="__RefHeading___Toc2514_496122586">
+          <w:hyperlink w:anchor="__RefHeading___Toc2522_231373292">
             <w:r>
               <w:rPr>
                 <w:rStyle w:val="IndexLink"/>
@@ -875,7 +875,7 @@
             </w:tabs>
             <w:rPr/>
           </w:pPr>
-          <w:hyperlink w:anchor="__RefHeading___Toc2516_496122586">
+          <w:hyperlink w:anchor="__RefHeading___Toc2524_231373292">
             <w:r>
               <w:rPr>
                 <w:rStyle w:val="IndexLink"/>
@@ -895,7 +895,7 @@
             </w:tabs>
             <w:rPr/>
           </w:pPr>
-          <w:hyperlink w:anchor="__RefHeading___Toc2518_496122586">
+          <w:hyperlink w:anchor="__RefHeading___Toc2526_231373292">
             <w:r>
               <w:rPr>
                 <w:rStyle w:val="IndexLink"/>
@@ -915,7 +915,7 @@
             </w:tabs>
             <w:rPr/>
           </w:pPr>
-          <w:hyperlink w:anchor="__RefHeading___Toc2520_496122586">
+          <w:hyperlink w:anchor="__RefHeading___Toc2528_231373292">
             <w:r>
               <w:rPr>
                 <w:rStyle w:val="IndexLink"/>
@@ -935,7 +935,7 @@
             </w:tabs>
             <w:rPr/>
           </w:pPr>
-          <w:hyperlink w:anchor="__RefHeading___Toc2522_496122586">
+          <w:hyperlink w:anchor="__RefHeading___Toc2530_231373292">
             <w:r>
               <w:rPr>
                 <w:rStyle w:val="IndexLink"/>
@@ -955,7 +955,7 @@
             </w:tabs>
             <w:rPr/>
           </w:pPr>
-          <w:hyperlink w:anchor="__RefHeading___Toc2524_496122586">
+          <w:hyperlink w:anchor="__RefHeading___Toc2532_231373292">
             <w:r>
               <w:rPr>
                 <w:rStyle w:val="IndexLink"/>
@@ -975,7 +975,7 @@
             </w:tabs>
             <w:rPr/>
           </w:pPr>
-          <w:hyperlink w:anchor="__RefHeading___Toc2526_496122586">
+          <w:hyperlink w:anchor="__RefHeading___Toc2534_231373292">
             <w:r>
               <w:rPr>
                 <w:rStyle w:val="IndexLink"/>
@@ -995,7 +995,7 @@
             </w:tabs>
             <w:rPr/>
           </w:pPr>
-          <w:hyperlink w:anchor="__RefHeading___Toc2528_496122586">
+          <w:hyperlink w:anchor="__RefHeading___Toc2536_231373292">
             <w:r>
               <w:rPr>
                 <w:rStyle w:val="IndexLink"/>
@@ -1015,7 +1015,7 @@
             </w:tabs>
             <w:rPr/>
           </w:pPr>
-          <w:hyperlink w:anchor="__RefHeading___Toc2530_496122586">
+          <w:hyperlink w:anchor="__RefHeading___Toc2538_231373292">
             <w:r>
               <w:rPr>
                 <w:rStyle w:val="IndexLink"/>
@@ -1035,12 +1035,12 @@
             </w:tabs>
             <w:rPr/>
           </w:pPr>
-          <w:hyperlink w:anchor="__RefHeading___Toc2532_496122586">
+          <w:hyperlink w:anchor="__RefHeading___Toc2540_231373292">
             <w:r>
               <w:rPr>
                 <w:rStyle w:val="IndexLink"/>
               </w:rPr>
-              <w:t>10.5 Phát hiện bảo mật cần xử lý: Row Level Security đang tắt</w:t>
+              <w:t>10.5 Row Level Security: phát hiện và cách đã xử lý</w:t>
               <w:tab/>
               <w:t>18</w:t>
             </w:r>
@@ -1055,7 +1055,7 @@
             </w:tabs>
             <w:rPr/>
           </w:pPr>
-          <w:hyperlink w:anchor="__RefHeading___Toc2534_496122586">
+          <w:hyperlink w:anchor="__RefHeading___Toc2542_231373292">
             <w:r>
               <w:rPr>
                 <w:rStyle w:val="IndexLink"/>
@@ -1075,7 +1075,7 @@
             </w:tabs>
             <w:rPr/>
           </w:pPr>
-          <w:hyperlink w:anchor="__RefHeading___Toc2536_496122586">
+          <w:hyperlink w:anchor="__RefHeading___Toc2544_231373292">
             <w:r>
               <w:rPr>
                 <w:rStyle w:val="IndexLink"/>
@@ -1112,7 +1112,7 @@
         <w:pStyle w:val="Heading1"/>
         <w:rPr/>
       </w:pPr>
-      <w:bookmarkStart w:id="0" w:name="__RefHeading___Toc2456_496122586"/>
+      <w:bookmarkStart w:id="0" w:name="__RefHeading___Toc2464_231373292"/>
       <w:bookmarkEnd w:id="0"/>
       <w:r>
         <w:rPr/>
@@ -1365,7 +1365,7 @@
                 <w:sz w:val="19"/>
                 <w:szCs w:val="19"/>
               </w:rPr>
-              <w:t>1.0 (16/10/2026) - theo mã nguồn sau PR #57 (75 model Prisma, 43 migration)</w:t>
+              <w:t>1.1 (16/10/2026) - theo mã nguồn sau PR #59 (75 model Prisma, 44 migration); 1.1: cập nhật mục 10.5 sau khi bật Row Level Security</w:t>
             </w:r>
           </w:p>
         </w:tc>
@@ -1727,18 +1727,7 @@
       </w:pPr>
       <w:r>
         <w:rPr/>
-        <w:t xml:space="preserve">Có một </w:t>
-      </w:r>
-      <w:r>
-        <w:rPr>
-          <w:b/>
-          <w:bCs/>
-        </w:rPr>
-        <w:t>phát hiện bảo mật cần xử lý</w:t>
-      </w:r>
-      <w:r>
-        <w:rPr/>
-        <w:t xml:space="preserve"> ở mục 10.5 - nên đọc trước.</w:t>
+        <w:t>Mục 10.5 mô tả lỗ hổng Row Level Security đã phát hiện và cách đã xử lý.</w:t>
       </w:r>
     </w:p>
     <w:p>
@@ -1761,7 +1750,7 @@
         <w:pStyle w:val="Heading1"/>
         <w:rPr/>
       </w:pPr>
-      <w:bookmarkStart w:id="1" w:name="__RefHeading___Toc2458_496122586"/>
+      <w:bookmarkStart w:id="1" w:name="__RefHeading___Toc2466_231373292"/>
       <w:bookmarkEnd w:id="1"/>
       <w:r>
         <w:rPr/>
@@ -2391,7 +2380,7 @@
         <w:pStyle w:val="Heading1"/>
         <w:rPr/>
       </w:pPr>
-      <w:bookmarkStart w:id="2" w:name="__RefHeading___Toc2460_496122586"/>
+      <w:bookmarkStart w:id="2" w:name="__RefHeading___Toc2468_231373292"/>
       <w:bookmarkEnd w:id="2"/>
       <w:r>
         <w:rPr/>
@@ -2403,7 +2392,7 @@
         <w:pStyle w:val="Heading2"/>
         <w:rPr/>
       </w:pPr>
-      <w:bookmarkStart w:id="3" w:name="__RefHeading___Toc2462_496122586"/>
+      <w:bookmarkStart w:id="3" w:name="__RefHeading___Toc2470_231373292"/>
       <w:bookmarkEnd w:id="3"/>
       <w:r>
         <w:rPr/>
@@ -3418,7 +3407,7 @@
         <w:pStyle w:val="Heading2"/>
         <w:rPr/>
       </w:pPr>
-      <w:bookmarkStart w:id="4" w:name="__RefHeading___Toc2464_496122586"/>
+      <w:bookmarkStart w:id="4" w:name="__RefHeading___Toc2472_231373292"/>
       <w:bookmarkEnd w:id="4"/>
       <w:r>
         <w:rPr/>
@@ -3708,7 +3697,7 @@
         <w:pStyle w:val="Heading1"/>
         <w:rPr/>
       </w:pPr>
-      <w:bookmarkStart w:id="5" w:name="__RefHeading___Toc2466_496122586"/>
+      <w:bookmarkStart w:id="5" w:name="__RefHeading___Toc2474_231373292"/>
       <w:bookmarkEnd w:id="5"/>
       <w:r>
         <w:rPr/>
@@ -5147,7 +5136,7 @@
         <w:pStyle w:val="Heading1"/>
         <w:rPr/>
       </w:pPr>
-      <w:bookmarkStart w:id="6" w:name="__RefHeading___Toc2468_496122586"/>
+      <w:bookmarkStart w:id="6" w:name="__RefHeading___Toc2476_231373292"/>
       <w:bookmarkEnd w:id="6"/>
       <w:r>
         <w:rPr/>
@@ -5300,7 +5289,7 @@
         <w:pStyle w:val="Heading2"/>
         <w:rPr/>
       </w:pPr>
-      <w:bookmarkStart w:id="7" w:name="__RefHeading___Toc2470_496122586"/>
+      <w:bookmarkStart w:id="7" w:name="__RefHeading___Toc2478_231373292"/>
       <w:bookmarkEnd w:id="7"/>
       <w:r>
         <w:rPr/>
@@ -6426,7 +6415,7 @@
         <w:pStyle w:val="Heading2"/>
         <w:rPr/>
       </w:pPr>
-      <w:bookmarkStart w:id="8" w:name="__RefHeading___Toc2472_496122586"/>
+      <w:bookmarkStart w:id="8" w:name="__RefHeading___Toc2480_231373292"/>
       <w:bookmarkEnd w:id="8"/>
       <w:r>
         <w:rPr/>
@@ -8289,7 +8278,7 @@
         <w:pStyle w:val="Heading2"/>
         <w:rPr/>
       </w:pPr>
-      <w:bookmarkStart w:id="9" w:name="__RefHeading___Toc2474_496122586"/>
+      <w:bookmarkStart w:id="9" w:name="__RefHeading___Toc2482_231373292"/>
       <w:bookmarkEnd w:id="9"/>
       <w:r>
         <w:rPr/>
@@ -8932,7 +8921,7 @@
         <w:pStyle w:val="Heading2"/>
         <w:rPr/>
       </w:pPr>
-      <w:bookmarkStart w:id="10" w:name="__RefHeading___Toc2476_496122586"/>
+      <w:bookmarkStart w:id="10" w:name="__RefHeading___Toc2484_231373292"/>
       <w:bookmarkEnd w:id="10"/>
       <w:r>
         <w:rPr/>
@@ -9329,7 +9318,7 @@
         <w:pStyle w:val="Heading2"/>
         <w:rPr/>
       </w:pPr>
-      <w:bookmarkStart w:id="11" w:name="__RefHeading___Toc2478_496122586"/>
+      <w:bookmarkStart w:id="11" w:name="__RefHeading___Toc2486_231373292"/>
       <w:bookmarkEnd w:id="11"/>
       <w:r>
         <w:rPr/>
@@ -9962,7 +9951,7 @@
         <w:pStyle w:val="Heading2"/>
         <w:rPr/>
       </w:pPr>
-      <w:bookmarkStart w:id="12" w:name="__RefHeading___Toc2480_496122586"/>
+      <w:bookmarkStart w:id="12" w:name="__RefHeading___Toc2488_231373292"/>
       <w:bookmarkEnd w:id="12"/>
       <w:r>
         <w:rPr/>
@@ -11209,7 +11198,7 @@
         <w:pStyle w:val="Heading2"/>
         <w:rPr/>
       </w:pPr>
-      <w:bookmarkStart w:id="13" w:name="__RefHeading___Toc2482_496122586"/>
+      <w:bookmarkStart w:id="13" w:name="__RefHeading___Toc2490_231373292"/>
       <w:bookmarkEnd w:id="13"/>
       <w:r>
         <w:rPr/>
@@ -12286,7 +12275,7 @@
         <w:pStyle w:val="Heading2"/>
         <w:rPr/>
       </w:pPr>
-      <w:bookmarkStart w:id="14" w:name="__RefHeading___Toc2484_496122586"/>
+      <w:bookmarkStart w:id="14" w:name="__RefHeading___Toc2492_231373292"/>
       <w:bookmarkEnd w:id="14"/>
       <w:r>
         <w:rPr/>
@@ -13108,7 +13097,7 @@
         <w:pStyle w:val="Heading2"/>
         <w:rPr/>
       </w:pPr>
-      <w:bookmarkStart w:id="15" w:name="__RefHeading___Toc2486_496122586"/>
+      <w:bookmarkStart w:id="15" w:name="__RefHeading___Toc2494_231373292"/>
       <w:bookmarkEnd w:id="15"/>
       <w:r>
         <w:rPr/>
@@ -13543,7 +13532,7 @@
         <w:pStyle w:val="Heading1"/>
         <w:rPr/>
       </w:pPr>
-      <w:bookmarkStart w:id="16" w:name="__RefHeading___Toc2488_496122586"/>
+      <w:bookmarkStart w:id="16" w:name="__RefHeading___Toc2496_231373292"/>
       <w:bookmarkEnd w:id="16"/>
       <w:r>
         <w:rPr/>
@@ -13555,7 +13544,7 @@
         <w:pStyle w:val="Heading2"/>
         <w:rPr/>
       </w:pPr>
-      <w:bookmarkStart w:id="17" w:name="__RefHeading___Toc2490_496122586"/>
+      <w:bookmarkStart w:id="17" w:name="__RefHeading___Toc2498_231373292"/>
       <w:bookmarkEnd w:id="17"/>
       <w:r>
         <w:rPr/>
@@ -14054,7 +14043,7 @@
         <w:pStyle w:val="Heading2"/>
         <w:rPr/>
       </w:pPr>
-      <w:bookmarkStart w:id="18" w:name="__RefHeading___Toc2492_496122586"/>
+      <w:bookmarkStart w:id="18" w:name="__RefHeading___Toc2500_231373292"/>
       <w:bookmarkEnd w:id="18"/>
       <w:r>
         <w:rPr/>
@@ -14505,7 +14494,7 @@
         <w:pStyle w:val="Heading2"/>
         <w:rPr/>
       </w:pPr>
-      <w:bookmarkStart w:id="19" w:name="__RefHeading___Toc2494_496122586"/>
+      <w:bookmarkStart w:id="19" w:name="__RefHeading___Toc2502_231373292"/>
       <w:bookmarkEnd w:id="19"/>
       <w:r>
         <w:rPr/>
@@ -15624,7 +15613,7 @@
         <w:pStyle w:val="Heading1"/>
         <w:rPr/>
       </w:pPr>
-      <w:bookmarkStart w:id="20" w:name="__RefHeading___Toc2496_496122586"/>
+      <w:bookmarkStart w:id="20" w:name="__RefHeading___Toc2504_231373292"/>
       <w:bookmarkEnd w:id="20"/>
       <w:r>
         <w:rPr/>
@@ -17128,7 +17117,7 @@
         <w:pStyle w:val="Heading1"/>
         <w:rPr/>
       </w:pPr>
-      <w:bookmarkStart w:id="21" w:name="__RefHeading___Toc2498_496122586"/>
+      <w:bookmarkStart w:id="21" w:name="__RefHeading___Toc2506_231373292"/>
       <w:bookmarkEnd w:id="21"/>
       <w:r>
         <w:rPr/>
@@ -18011,7 +18000,7 @@
         <w:pStyle w:val="Heading1"/>
         <w:rPr/>
       </w:pPr>
-      <w:bookmarkStart w:id="22" w:name="__RefHeading___Toc2500_496122586"/>
+      <w:bookmarkStart w:id="22" w:name="__RefHeading___Toc2508_231373292"/>
       <w:bookmarkEnd w:id="22"/>
       <w:r>
         <w:rPr/>
@@ -18023,7 +18012,7 @@
         <w:pStyle w:val="Heading2"/>
         <w:rPr/>
       </w:pPr>
-      <w:bookmarkStart w:id="23" w:name="__RefHeading___Toc2502_496122586"/>
+      <w:bookmarkStart w:id="23" w:name="__RefHeading___Toc2510_231373292"/>
       <w:bookmarkEnd w:id="23"/>
       <w:r>
         <w:rPr/>
@@ -18055,7 +18044,7 @@
       </w:r>
       <w:r>
         <w:rPr/>
-        <w:t xml:space="preserve"> (hiện 43 migration, từ </w:t>
+        <w:t xml:space="preserve"> (hiện 44 migration, từ </w:t>
       </w:r>
       <w:r>
         <w:rPr>
@@ -18077,7 +18066,7 @@
           <w:sz w:val="19"/>
           <w:szCs w:val="19"/>
         </w:rPr>
-        <w:t>20270102000000_project_member_permissions</w:t>
+        <w:t>20270103000000_lock_down_data_api</w:t>
       </w:r>
       <w:r>
         <w:rPr/>
@@ -18160,7 +18149,7 @@
         <w:pStyle w:val="Heading2"/>
         <w:rPr/>
       </w:pPr>
-      <w:bookmarkStart w:id="24" w:name="__RefHeading___Toc2504_496122586"/>
+      <w:bookmarkStart w:id="24" w:name="__RefHeading___Toc2512_231373292"/>
       <w:bookmarkEnd w:id="24"/>
       <w:r>
         <w:rPr/>
@@ -18226,7 +18215,7 @@
         <w:pStyle w:val="Heading2"/>
         <w:rPr/>
       </w:pPr>
-      <w:bookmarkStart w:id="25" w:name="__RefHeading___Toc2506_496122586"/>
+      <w:bookmarkStart w:id="25" w:name="__RefHeading___Toc2514_231373292"/>
       <w:bookmarkEnd w:id="25"/>
       <w:r>
         <w:rPr/>
@@ -18481,7 +18470,7 @@
         <w:pStyle w:val="Heading2"/>
         <w:rPr/>
       </w:pPr>
-      <w:bookmarkStart w:id="26" w:name="__RefHeading___Toc2508_496122586"/>
+      <w:bookmarkStart w:id="26" w:name="__RefHeading___Toc2516_231373292"/>
       <w:bookmarkEnd w:id="26"/>
       <w:r>
         <w:rPr/>
@@ -18614,7 +18603,7 @@
         <w:pStyle w:val="Heading2"/>
         <w:rPr/>
       </w:pPr>
-      <w:bookmarkStart w:id="27" w:name="__RefHeading___Toc2510_496122586"/>
+      <w:bookmarkStart w:id="27" w:name="__RefHeading___Toc2518_231373292"/>
       <w:bookmarkEnd w:id="27"/>
       <w:r>
         <w:rPr/>
@@ -18972,7 +18961,7 @@
         <w:pStyle w:val="Heading2"/>
         <w:rPr/>
       </w:pPr>
-      <w:bookmarkStart w:id="28" w:name="__RefHeading___Toc2512_496122586"/>
+      <w:bookmarkStart w:id="28" w:name="__RefHeading___Toc2520_231373292"/>
       <w:bookmarkEnd w:id="28"/>
       <w:r>
         <w:rPr/>
@@ -19012,7 +19001,7 @@
         <w:pStyle w:val="Heading1"/>
         <w:rPr/>
       </w:pPr>
-      <w:bookmarkStart w:id="29" w:name="__RefHeading___Toc2514_496122586"/>
+      <w:bookmarkStart w:id="29" w:name="__RefHeading___Toc2522_231373292"/>
       <w:bookmarkEnd w:id="29"/>
       <w:r>
         <w:rPr/>
@@ -19024,7 +19013,7 @@
         <w:pStyle w:val="Heading2"/>
         <w:rPr/>
       </w:pPr>
-      <w:bookmarkStart w:id="30" w:name="__RefHeading___Toc2516_496122586"/>
+      <w:bookmarkStart w:id="30" w:name="__RefHeading___Toc2524_231373292"/>
       <w:bookmarkEnd w:id="30"/>
       <w:r>
         <w:rPr/>
@@ -19632,7 +19621,7 @@
         <w:pStyle w:val="Heading2"/>
         <w:rPr/>
       </w:pPr>
-      <w:bookmarkStart w:id="31" w:name="__RefHeading___Toc2518_496122586"/>
+      <w:bookmarkStart w:id="31" w:name="__RefHeading___Toc2526_231373292"/>
       <w:bookmarkEnd w:id="31"/>
       <w:r>
         <w:rPr/>
@@ -20491,7 +20480,7 @@
         <w:pStyle w:val="Heading2"/>
         <w:rPr/>
       </w:pPr>
-      <w:bookmarkStart w:id="32" w:name="__RefHeading___Toc2520_496122586"/>
+      <w:bookmarkStart w:id="32" w:name="__RefHeading___Toc2528_231373292"/>
       <w:bookmarkEnd w:id="32"/>
       <w:r>
         <w:rPr/>
@@ -20704,7 +20693,7 @@
         <w:pStyle w:val="Heading1"/>
         <w:rPr/>
       </w:pPr>
-      <w:bookmarkStart w:id="33" w:name="__RefHeading___Toc2522_496122586"/>
+      <w:bookmarkStart w:id="33" w:name="__RefHeading___Toc2530_231373292"/>
       <w:bookmarkEnd w:id="33"/>
       <w:r>
         <w:rPr/>
@@ -20716,7 +20705,7 @@
         <w:pStyle w:val="Heading2"/>
         <w:rPr/>
       </w:pPr>
-      <w:bookmarkStart w:id="34" w:name="__RefHeading___Toc2524_496122586"/>
+      <w:bookmarkStart w:id="34" w:name="__RefHeading___Toc2532_231373292"/>
       <w:bookmarkEnd w:id="34"/>
       <w:r>
         <w:rPr/>
@@ -21227,7 +21216,7 @@
         <w:pStyle w:val="Heading2"/>
         <w:rPr/>
       </w:pPr>
-      <w:bookmarkStart w:id="35" w:name="__RefHeading___Toc2526_496122586"/>
+      <w:bookmarkStart w:id="35" w:name="__RefHeading___Toc2534_231373292"/>
       <w:bookmarkEnd w:id="35"/>
       <w:r>
         <w:rPr/>
@@ -21425,7 +21414,7 @@
         <w:pStyle w:val="Heading2"/>
         <w:rPr/>
       </w:pPr>
-      <w:bookmarkStart w:id="36" w:name="__RefHeading___Toc2528_496122586"/>
+      <w:bookmarkStart w:id="36" w:name="__RefHeading___Toc2536_231373292"/>
       <w:bookmarkEnd w:id="36"/>
       <w:r>
         <w:rPr/>
@@ -21545,7 +21534,7 @@
         <w:pStyle w:val="Heading2"/>
         <w:rPr/>
       </w:pPr>
-      <w:bookmarkStart w:id="37" w:name="__RefHeading___Toc2530_496122586"/>
+      <w:bookmarkStart w:id="37" w:name="__RefHeading___Toc2538_231373292"/>
       <w:bookmarkEnd w:id="37"/>
       <w:r>
         <w:rPr/>
@@ -22530,11 +22519,11 @@
         <w:pStyle w:val="Heading2"/>
         <w:rPr/>
       </w:pPr>
-      <w:bookmarkStart w:id="38" w:name="__RefHeading___Toc2532_496122586"/>
+      <w:bookmarkStart w:id="38" w:name="__RefHeading___Toc2540_231373292"/>
       <w:bookmarkEnd w:id="38"/>
       <w:r>
         <w:rPr/>
-        <w:t>10.5 Phát hiện bảo mật cần xử lý: Row Level Security đang tắt</w:t>
+        <w:t>10.5 Row Level Security: phát hiện và cách đã xử lý</w:t>
       </w:r>
     </w:p>
     <w:p>
@@ -22948,12 +22937,115 @@
     </w:p>
     <w:p>
       <w:pPr>
+        <w:pStyle w:val="Normal"/>
+        <w:pBdr>
+          <w:left w:val="single" w:sz="24" w:space="8" w:color="000000"/>
+        </w:pBdr>
+        <w:shd w:val="clear" w:color="auto" w:fill="F2F2F2"/>
+        <w:spacing w:before="120" w:after="0"/>
+        <w:ind w:left="200" w:right="200"/>
+        <w:rPr/>
+      </w:pPr>
+      <w:r>
+        <w:rPr>
+          <w:b/>
+          <w:bCs/>
+          <w:color w:val="000000"/>
+        </w:rPr>
+        <w:t>Trạng thái</w:t>
+      </w:r>
+    </w:p>
+    <w:p>
+      <w:pPr>
+        <w:pStyle w:val="Normal"/>
+        <w:pBdr>
+          <w:left w:val="single" w:sz="24" w:space="8" w:color="000000"/>
+        </w:pBdr>
+        <w:shd w:val="clear" w:color="auto" w:fill="F2F2F2"/>
+        <w:spacing w:lineRule="exact" w:line="290" w:before="0" w:after="0"/>
+        <w:ind w:left="200" w:right="200"/>
+        <w:rPr/>
+      </w:pPr>
+      <w:r>
+        <w:rPr/>
+        <w:t xml:space="preserve">Đã xử lý bằng migration </w:t>
+      </w:r>
+      <w:r>
+        <w:rPr>
+          <w:rFonts w:eastAsia="Consolas" w:cs="Consolas" w:ascii="Consolas" w:hAnsi="Consolas"/>
+          <w:color w:val="000000"/>
+          <w:sz w:val="19"/>
+          <w:szCs w:val="19"/>
+        </w:rPr>
+        <w:t>20270103000000_lock_down_data_api</w:t>
+      </w:r>
+      <w:r>
+        <w:rPr/>
+        <w:t xml:space="preserve"> (PR #59): bật RLS trên mọi bảng, thu hồi quyền của </w:t>
+      </w:r>
+      <w:r>
+        <w:rPr>
+          <w:rFonts w:eastAsia="Consolas" w:cs="Consolas" w:ascii="Consolas" w:hAnsi="Consolas"/>
+          <w:color w:val="000000"/>
+          <w:sz w:val="19"/>
+          <w:szCs w:val="19"/>
+        </w:rPr>
+        <w:t>anon</w:t>
+      </w:r>
+      <w:r>
+        <w:rPr/>
+        <w:t xml:space="preserve"> / </w:t>
+      </w:r>
+      <w:r>
+        <w:rPr>
+          <w:rFonts w:eastAsia="Consolas" w:cs="Consolas" w:ascii="Consolas" w:hAnsi="Consolas"/>
+          <w:color w:val="000000"/>
+          <w:sz w:val="19"/>
+          <w:szCs w:val="19"/>
+        </w:rPr>
+        <w:t>authenticated</w:t>
+      </w:r>
+      <w:r>
+        <w:rPr/>
+        <w:t xml:space="preserve"> (cả cho bảng tạo sau này), cố định </w:t>
+      </w:r>
+      <w:r>
+        <w:rPr>
+          <w:rFonts w:eastAsia="Consolas" w:cs="Consolas" w:ascii="Consolas" w:hAnsi="Consolas"/>
+          <w:color w:val="000000"/>
+          <w:sz w:val="19"/>
+          <w:szCs w:val="19"/>
+        </w:rPr>
+        <w:t>search_path</w:t>
+      </w:r>
+      <w:r>
+        <w:rPr/>
+        <w:t xml:space="preserve"> của 28 hàm trigger. Đã thử trên môi trường giả lập Supabase: trước khi sửa vai trò khách đọc được bảng, sau khi sửa bị từ chối; app vẫn đọc/ghi bình thường. Test tích hợp sẽ báo lỗi nếu migration sau này tạo bảng mà quên bật RLS.</w:t>
+      </w:r>
+    </w:p>
+    <w:p>
+      <w:pPr>
+        <w:pStyle w:val="Normal"/>
+        <w:pBdr>
+          <w:left w:val="single" w:sz="24" w:space="8" w:color="000000"/>
+        </w:pBdr>
+        <w:shd w:val="clear" w:color="auto" w:fill="F2F2F2"/>
+        <w:spacing w:before="0" w:after="160"/>
+        <w:ind w:left="200" w:right="200"/>
+        <w:rPr/>
+      </w:pPr>
+      <w:r>
+        <w:rPr/>
+      </w:r>
+    </w:p>
+    <w:p>
+      <w:pPr>
         <w:pStyle w:val="Heading3"/>
         <w:rPr/>
       </w:pPr>
       <w:r>
         <w:rPr/>
-        <w:t>Cách xử lý đề xuất (an toàn cho app)</w:t>
+        <w:t>Các bước đã thực hiện</w:t>
       </w:r>
     </w:p>
     <w:p>
@@ -23132,7 +23224,7 @@
       </w:pPr>
       <w:r>
         <w:rPr/>
-        <w:t>Đưa bước "bật RLS" vào quy trình khôi phục / chuyển DB (mục 8.5).</w:t>
+        <w:t>Đưa bước "bật RLS" vào quy trình khôi phục / chuyển DB (mục 8.5) - nếu khôi phục bằng pg_restore từ bản sao lưu sau ngày sửa, RLS đã có sẵn trong bản sao lưu.</w:t>
       </w:r>
     </w:p>
     <w:p>
@@ -23181,7 +23273,7 @@
       </w:r>
       <w:r>
         <w:rPr/>
-        <w:t xml:space="preserve"> ("Function Search Path Mutable"). Rủi ro thấp hơn; có thể sửa cùng migration trên bằng </w:t>
+        <w:t xml:space="preserve"> ("Function Search Path Mutable") - đã sửa trong cùng migration (</w:t>
       </w:r>
       <w:r>
         <w:rPr>
@@ -23190,11 +23282,11 @@
           <w:sz w:val="19"/>
           <w:szCs w:val="19"/>
         </w:rPr>
-        <w:t>ALTER FUNCTION … SET search_path = public</w:t>
-      </w:r>
-      <w:r>
-        <w:rPr/>
-        <w:t>.</w:t>
+        <w:t>SET search_path = public, pg_temp</w:t>
+      </w:r>
+      <w:r>
+        <w:rPr/>
+        <w:t>).</w:t>
       </w:r>
     </w:p>
     <w:p>
@@ -23217,7 +23309,7 @@
         <w:pStyle w:val="Heading1"/>
         <w:rPr/>
       </w:pPr>
-      <w:bookmarkStart w:id="39" w:name="__RefHeading___Toc2534_496122586"/>
+      <w:bookmarkStart w:id="39" w:name="__RefHeading___Toc2542_231373292"/>
       <w:bookmarkEnd w:id="39"/>
       <w:r>
         <w:rPr/>
@@ -24127,7 +24219,7 @@
         <w:pStyle w:val="Heading1"/>
         <w:rPr/>
       </w:pPr>
-      <w:bookmarkStart w:id="40" w:name="__RefHeading___Toc2536_496122586"/>
+      <w:bookmarkStart w:id="40" w:name="__RefHeading___Toc2544_231373292"/>
       <w:bookmarkEnd w:id="40"/>
       <w:r>
         <w:rPr/>

</xml_diff>